<commit_message>
LA MARQUE 2부 9화: rename Bastien's employer (Vernet Pharma) to avoid clash with Hugo Lambert
Co-Authored-By: Claude Opus 5.5 <noreply@anthropic.com>
Claude-Session: https://claude.ai/code/session_01N4vhCLeYxrjvGnDxQBD9Cq
</commit_message>
<xml_diff>
--- a/la-marque/대본/2부/09화_Le_PRRC.docx
+++ b/la-marque/대본/2부/09화_Le_PRRC.docx
@@ -53,7 +53,7 @@
         <w:t xml:space="preserve"> </w:t>
       </w:r>
       <w:r>
-        <w:t xml:space="preserve">가능해야 하므로 람베르 제약을 떠날지 결정. 부속서 XVI·공통 규격과</w:t>
+        <w:t xml:space="preserve">가능해야 하므로 베르네 제약을 떠날지 결정. 부속서 XVI·공통 규격과</w:t>
       </w:r>
       <w:r>
         <w:t xml:space="preserve"> </w:t>
@@ -162,7 +162,7 @@
           <w:bCs/>
           <w:b/>
         </w:rPr>
-        <w:t xml:space="preserve">→ 바스티앵은 아직 람베르 제약에서 주 3일(1부부터의 주 2일 체제) → PRRC는</w:t>
+        <w:t xml:space="preserve">→ 바스티앵은 아직 베르네 제약에서 주 3일(1부부터의 주 2일 체제) → PRRC는</w:t>
       </w:r>
       <w:r>
         <w:rPr>
@@ -515,7 +515,7 @@
         <w:t xml:space="preserve">“</w:t>
       </w:r>
       <w:r>
-        <w:t xml:space="preserve">람베르엔 앞에 열 명 뒤에 스무 명, 여기선 나뿐</w:t>
+        <w:t xml:space="preserve">베르네엔 앞에 열 명 뒤에 스무 명, 여기선 나뿐</w:t>
       </w:r>
       <w:r>
         <w:t xml:space="preserve">”</w:t>
@@ -534,7 +534,7 @@
           <w:bCs/>
           <w:b/>
         </w:rPr>
-        <w:t xml:space="preserve">결정 11번: 바스티앵 전일제 PRRC(람베르 3개월 예고),</w:t>
+        <w:t xml:space="preserve">결정 11번: 바스티앵 전일제 PRRC(베르네 3개월 예고),</w:t>
       </w:r>
       <w:r>
         <w:rPr>
@@ -855,7 +855,7 @@
         <w:pStyle w:val="BodyText"/>
       </w:pPr>
       <w:r>
-        <w:t xml:space="preserve">BASTIEN: Parce que je travaille encore trois jours par semaine chez Lambert Pharma. Elle a lu mon CV.</w:t>
+        <w:t xml:space="preserve">BASTIEN: Parce que je travaille encore trois jours par semaine chez Vernet Pharma. Elle a lu mon CV.</w:t>
       </w:r>
     </w:p>
     <w:p>
@@ -879,7 +879,7 @@
         <w:pStyle w:val="BodyText"/>
       </w:pPr>
       <w:r>
-        <w:t xml:space="preserve">CLEMENCE: En permanence. Même le mardi, quand tu es chez Lambert ?</w:t>
+        <w:t xml:space="preserve">CLEMENCE: En permanence. Même le mardi, quand tu es chez Vernet ?</w:t>
       </w:r>
     </w:p>
     <w:p>
@@ -895,7 +895,7 @@
         <w:pStyle w:val="BodyText"/>
       </w:pPr>
       <w:r>
-        <w:t xml:space="preserve">INES: Donc il faut que tu sois ici tout le temps. Que tu quittes Lambert.</w:t>
+        <w:t xml:space="preserve">INES: Donc il faut que tu sois ici tout le temps. Que tu quittes Vernet.</w:t>
       </w:r>
     </w:p>
     <w:p>
@@ -1185,7 +1185,7 @@
         <w:pStyle w:val="BodyText"/>
       </w:pPr>
       <w:r>
-        <w:t xml:space="preserve">INES: Revenons au PRRC. Tu vas quitter Lambert, Bastien ?</w:t>
+        <w:t xml:space="preserve">INES: Revenons au PRRC. Tu vas quitter Vernet, Bastien ?</w:t>
       </w:r>
     </w:p>
     <w:p>
@@ -1235,7 +1235,7 @@
         <w:pStyle w:val="BodyText"/>
       </w:pPr>
       <w:r>
-        <w:t xml:space="preserve">BASTIEN: Liane a besoin d’un PRRC à plein temps. Ça veut dire quitter Lambert. Avant la levée de fonds.</w:t>
+        <w:t xml:space="preserve">BASTIEN: Liane a besoin d’un PRRC à plein temps. Ça veut dire quitter Vernet. Avant la levée de fonds.</w:t>
       </w:r>
     </w:p>
     <w:p>
@@ -1323,15 +1323,15 @@
         <w:pStyle w:val="BodyText"/>
       </w:pPr>
       <w:r>
-        <w:t xml:space="preserve">SOPHIE: Chez Lambert, tu signes aussi des lots. Depuis quinze ans.</w:t>
-      </w:r>
-    </w:p>
-    <w:p>
-      <w:pPr>
-        <w:pStyle w:val="BodyText"/>
-      </w:pPr>
-      <w:r>
-        <w:t xml:space="preserve">BASTIEN: Chez Lambert, il y a dix personnes avant moi, et vingt après. Ici, il n’y a que moi.</w:t>
+        <w:t xml:space="preserve">SOPHIE: Chez Vernet, tu signes aussi des lots. Depuis quinze ans.</w:t>
+      </w:r>
+    </w:p>
+    <w:p>
+      <w:pPr>
+        <w:pStyle w:val="BodyText"/>
+      </w:pPr>
+      <w:r>
+        <w:t xml:space="preserve">BASTIEN: Chez Vernet, il y a dix personnes avant moi, et vingt après. Ici, il n’y a que moi.</w:t>
       </w:r>
     </w:p>
     <w:p>
@@ -1477,7 +1477,7 @@
         <w:pStyle w:val="FirstParagraph"/>
       </w:pPr>
       <w:r>
-        <w:t xml:space="preserve">BASTIEN: Sophie et moi, on a décidé. Je démissionne de chez Lambert. Trois mois de préavis.</w:t>
+        <w:t xml:space="preserve">BASTIEN: Sophie et moi, on a décidé. Je démissionne de chez Vernet. Trois mois de préavis.</w:t>
       </w:r>
     </w:p>
     <w:p>
@@ -1565,7 +1565,7 @@
         <w:pStyle w:val="BodyText"/>
       </w:pPr>
       <w:r>
-        <w:t xml:space="preserve">INES: Et ton salaire ? Avant la levée, on ne peut pas te payer comme Lambert.</w:t>
+        <w:t xml:space="preserve">INES: Et ton salaire ? Avant la levée, on ne peut pas te payer comme Vernet.</w:t>
       </w:r>
     </w:p>
     <w:p>
@@ -3439,7 +3439,7 @@
         <w:pStyle w:val="BodyText"/>
       </w:pPr>
       <w:r>
-        <w:t xml:space="preserve">바스티앵: 내가 아직 일주일에 사흘을 람베르 제약에서 일하니까. 내 이력서를 읽었대.</w:t>
+        <w:t xml:space="preserve">바스티앵: 내가 아직 일주일에 사흘을 베르네 제약에서 일하니까. 내 이력서를 읽었대.</w:t>
       </w:r>
     </w:p>
     <w:p>
@@ -3463,7 +3463,7 @@
         <w:pStyle w:val="BodyText"/>
       </w:pPr>
       <w:r>
-        <w:t xml:space="preserve">클레망스: 상시적으로. 람베르에 있는 화요일에도?</w:t>
+        <w:t xml:space="preserve">클레망스: 상시적으로. 베르네에 있는 화요일에도?</w:t>
       </w:r>
     </w:p>
     <w:p>
@@ -3479,7 +3479,7 @@
         <w:pStyle w:val="BodyText"/>
       </w:pPr>
       <w:r>
-        <w:t xml:space="preserve">이네스: 그러니까 네가 항상 여기 있어야 한다는 거네. 람베르를 그만둬야 한다는 거고.</w:t>
+        <w:t xml:space="preserve">이네스: 그러니까 네가 항상 여기 있어야 한다는 거네. 베르네를 그만둬야 한다는 거고.</w:t>
       </w:r>
     </w:p>
     <w:p>
@@ -3769,7 +3769,7 @@
         <w:pStyle w:val="BodyText"/>
       </w:pPr>
       <w:r>
-        <w:t xml:space="preserve">이네스: PRRC 얘기로 돌아가자. 람베르 그만둘 거야, 바스티앵?</w:t>
+        <w:t xml:space="preserve">이네스: PRRC 얘기로 돌아가자. 베르네 그만둘 거야, 바스티앵?</w:t>
       </w:r>
     </w:p>
     <w:p>
@@ -3819,7 +3819,7 @@
         <w:pStyle w:val="BodyText"/>
       </w:pPr>
       <w:r>
-        <w:t xml:space="preserve">바스티앵: 리안에 전일제 PRRC가 필요해. 람베르를 그만둬야 한다는 뜻이야. 투자 유치 전에.</w:t>
+        <w:t xml:space="preserve">바스티앵: 리안에 전일제 PRRC가 필요해. 베르네를 그만둬야 한다는 뜻이야. 투자 유치 전에.</w:t>
       </w:r>
     </w:p>
     <w:p>
@@ -3907,15 +3907,15 @@
         <w:pStyle w:val="BodyText"/>
       </w:pPr>
       <w:r>
-        <w:t xml:space="preserve">소피: 람베르에서도 로트에 서명하잖아. 15년째.</w:t>
-      </w:r>
-    </w:p>
-    <w:p>
-      <w:pPr>
-        <w:pStyle w:val="BodyText"/>
-      </w:pPr>
-      <w:r>
-        <w:t xml:space="preserve">바스티앵: 람베르에선 내 앞에 열 명, 뒤에 스무 명이 있어. 여기선 나뿐이야.</w:t>
+        <w:t xml:space="preserve">소피: 베르네에서도 로트에 서명하잖아. 15년째.</w:t>
+      </w:r>
+    </w:p>
+    <w:p>
+      <w:pPr>
+        <w:pStyle w:val="BodyText"/>
+      </w:pPr>
+      <w:r>
+        <w:t xml:space="preserve">바스티앵: 베르네에선 내 앞에 열 명, 뒤에 스무 명이 있어. 여기선 나뿐이야.</w:t>
       </w:r>
     </w:p>
     <w:p>
@@ -4061,7 +4061,7 @@
         <w:pStyle w:val="FirstParagraph"/>
       </w:pPr>
       <w:r>
-        <w:t xml:space="preserve">바스티앵: 소피랑 결정했어. 람베르를 그만둘게. 예고 기간 3개월.</w:t>
+        <w:t xml:space="preserve">바스티앵: 소피랑 결정했어. 베르네를 그만둘게. 예고 기간 3개월.</w:t>
       </w:r>
     </w:p>
     <w:p>
@@ -4149,7 +4149,7 @@
         <w:pStyle w:val="BodyText"/>
       </w:pPr>
       <w:r>
-        <w:t xml:space="preserve">이네스: 그럼 월급은? 투자 전에는 람베르만큼 못 줘.</w:t>
+        <w:t xml:space="preserve">이네스: 그럼 월급은? 투자 전에는 베르네만큼 못 줘.</w:t>
       </w:r>
     </w:p>
     <w:p>

</xml_diff>